<commit_message>
Update academic documents for Flutter and Python integration
This commit replaces the existing binary document related to Flutter and Python integration in the academic section with an updated version. The new document ensures that users have access to the most relevant and current resources, enhancing the overall quality of the documentation.
</commit_message>
<xml_diff>
--- a/docs/academic/基于Flutter与Python的跨平台数字笔记系统的设计与实现_论文初稿.docx
+++ b/docs/academic/基于Flutter与Python的跨平台数字笔记系统的设计与实现_论文初稿.docx
@@ -185,19 +185,21 @@
     </w:p>
     <w:p>
       <w:pPr>
-        <w:ind w:firstLine="841" w:firstLineChars="280"/>
+        <w:ind w:firstLine="1345" w:firstLineChars="280"/>
         <w:jc w:val="left"/>
         <w:rPr>
           <w:rFonts w:hint="eastAsia"/>
           <w:b/>
-          <w:sz w:val="36"/>
+          <w:sz w:val="48"/>
+          <w:szCs w:val="48"/>
         </w:rPr>
       </w:pPr>
       <w:r>
         <w:rPr>
           <w:rFonts w:ascii="STHeiti" w:hAnsi="STHeiti" w:eastAsia="STHeiti" w:cs="STHeiti"/>
           <w:b/>
-          <w:sz w:val="30"/>
+          <w:sz w:val="48"/>
+          <w:szCs w:val="48"/>
         </w:rPr>
         <w:t>题  目：基于 Flutter 与 Python 的跨平台数字笔记系统的设计与实现</w:t>
       </w:r>
@@ -244,10 +246,11 @@
         <w:spacing w:line="360" w:lineRule="auto"/>
         <w:ind w:firstLine="1800"/>
         <w:rPr>
-          <w:rFonts w:hint="eastAsia"/>
+          <w:rFonts w:hint="default" w:eastAsia="SimSong"/>
           <w:b/>
           <w:sz w:val="28"/>
           <w:szCs w:val="28"/>
+          <w:lang w:val="en-US" w:eastAsia="zh-CN"/>
         </w:rPr>
       </w:pPr>
       <w:r>
@@ -256,6 +259,14 @@
           <w:sz w:val="24"/>
         </w:rPr>
         <w:t>专业（层次）：</w:t>
+      </w:r>
+      <w:r>
+        <w:rPr>
+          <w:rFonts w:hint="eastAsia" w:ascii="SimSong" w:hAnsi="SimSong" w:eastAsia="SimSong" w:cs="SimSong"/>
+          <w:sz w:val="24"/>
+          <w:lang w:val="en-US" w:eastAsia="zh-CN"/>
+        </w:rPr>
+        <w:t>计算机科学与技术（专升本）</w:t>
       </w:r>
     </w:p>
     <w:p>
@@ -266,9 +277,11 @@
         <w:spacing w:line="360" w:lineRule="auto"/>
         <w:ind w:firstLine="1800"/>
         <w:rPr>
+          <w:rFonts w:hint="default" w:eastAsia="SimSong"/>
           <w:b/>
           <w:sz w:val="28"/>
           <w:szCs w:val="28"/>
+          <w:lang w:val="en-US" w:eastAsia="zh-CN"/>
         </w:rPr>
       </w:pPr>
       <w:r>
@@ -277,6 +290,14 @@
           <w:sz w:val="24"/>
         </w:rPr>
         <w:t>年    级：</w:t>
+      </w:r>
+      <w:r>
+        <w:rPr>
+          <w:rFonts w:hint="eastAsia" w:ascii="SimSong" w:hAnsi="SimSong" w:eastAsia="SimSong" w:cs="SimSong"/>
+          <w:sz w:val="24"/>
+          <w:lang w:val="en-US" w:eastAsia="zh-CN"/>
+        </w:rPr>
+        <w:t>2023级</w:t>
       </w:r>
     </w:p>
     <w:p>
@@ -287,9 +308,11 @@
         <w:spacing w:line="360" w:lineRule="auto"/>
         <w:ind w:firstLine="1800"/>
         <w:rPr>
+          <w:rFonts w:hint="eastAsia" w:eastAsia="SimSong"/>
           <w:b/>
           <w:sz w:val="28"/>
           <w:szCs w:val="28"/>
+          <w:lang w:val="en-US" w:eastAsia="zh-CN"/>
         </w:rPr>
       </w:pPr>
       <w:r>
@@ -298,6 +321,14 @@
           <w:sz w:val="24"/>
         </w:rPr>
         <w:t>班    级：</w:t>
+      </w:r>
+      <w:r>
+        <w:rPr>
+          <w:rFonts w:hint="eastAsia" w:ascii="SimSong" w:hAnsi="SimSong" w:eastAsia="SimSong" w:cs="SimSong"/>
+          <w:sz w:val="24"/>
+          <w:lang w:val="en-US" w:eastAsia="zh-CN"/>
+        </w:rPr>
+        <w:t>二班</w:t>
       </w:r>
     </w:p>
     <w:p>
@@ -646,9 +677,10 @@
         <w:spacing w:line="520" w:lineRule="exact"/>
         <w:ind w:firstLine="480" w:firstLineChars="200"/>
         <w:rPr>
-          <w:rFonts w:eastAsia="仿宋"/>
+          <w:rFonts w:hint="eastAsia" w:eastAsia="SimSong"/>
           <w:sz w:val="28"/>
           <w:szCs w:val="28"/>
+          <w:lang w:val="en-US" w:eastAsia="zh-CN"/>
         </w:rPr>
       </w:pPr>
       <w:r>
@@ -2670,11 +2702,19 @@
       </w:pPr>
       <w:r>
         <w:rPr>
-          <w:rFonts w:ascii="Times New Roman" w:hAnsi="Times New Roman" w:eastAsia="黑体" w:cs="Times New Roman"/>
-          <w:b/>
-          <w:sz w:val="24"/>
-        </w:rPr>
-        <w:t>关键词：</w:t>
+          <w:rFonts w:hint="eastAsia" w:ascii="宋体" w:hAnsi="宋体" w:eastAsia="宋体" w:cs="宋体"/>
+          <w:b/>
+          <w:sz w:val="24"/>
+        </w:rPr>
+        <w:t>关键词</w:t>
+      </w:r>
+      <w:r>
+        <w:rPr>
+          <w:rFonts w:ascii="Times New Roman" w:hAnsi="Times New Roman" w:eastAsia="黑体" w:cs="Times New Roman"/>
+          <w:b/>
+          <w:sz w:val="24"/>
+        </w:rPr>
+        <w:t>：</w:t>
       </w:r>
       <w:r>
         <w:rPr>
@@ -2834,7 +2874,16 @@
           <w:b/>
           <w:sz w:val="28"/>
         </w:rPr>
-        <w:t>1.1 课题背景与研究意义</w:t>
+        <w:t xml:space="preserve">1.1 </w:t>
+      </w:r>
+      <w:r>
+        <w:rPr>
+          <w:rFonts w:ascii="Times New Roman" w:hAnsi="Times New Roman" w:eastAsia="黑体" w:cs="Times New Roman"/>
+          <w:b/>
+          <w:sz w:val="30"/>
+          <w:szCs w:val="30"/>
+        </w:rPr>
+        <w:t>课题背景与研究意义</w:t>
       </w:r>
     </w:p>
     <w:p>
@@ -2990,7 +3039,16 @@
           <w:b/>
           <w:sz w:val="28"/>
         </w:rPr>
-        <w:t>1.2 国内外发展状况</w:t>
+        <w:t xml:space="preserve">1.2 </w:t>
+      </w:r>
+      <w:r>
+        <w:rPr>
+          <w:rFonts w:ascii="Times New Roman" w:hAnsi="Times New Roman" w:eastAsia="黑体" w:cs="Times New Roman"/>
+          <w:b/>
+          <w:sz w:val="30"/>
+          <w:szCs w:val="30"/>
+        </w:rPr>
+        <w:t>国内外发展状况</w:t>
       </w:r>
     </w:p>
     <w:p>
@@ -3206,7 +3264,16 @@
           <w:b/>
           <w:sz w:val="28"/>
         </w:rPr>
-        <w:t>1.3 研究目标与主要内容</w:t>
+        <w:t xml:space="preserve">1.3 </w:t>
+      </w:r>
+      <w:r>
+        <w:rPr>
+          <w:rFonts w:ascii="Times New Roman" w:hAnsi="Times New Roman" w:eastAsia="黑体" w:cs="Times New Roman"/>
+          <w:b/>
+          <w:sz w:val="30"/>
+          <w:szCs w:val="30"/>
+        </w:rPr>
+        <w:t>研究目标与主要内容</w:t>
       </w:r>
     </w:p>
     <w:p>
@@ -3238,7 +3305,16 @@
           <w:b/>
           <w:sz w:val="28"/>
         </w:rPr>
-        <w:t>1.4 论文组织结构</w:t>
+        <w:t xml:space="preserve">1.4 </w:t>
+      </w:r>
+      <w:r>
+        <w:rPr>
+          <w:rFonts w:ascii="Times New Roman" w:hAnsi="Times New Roman" w:eastAsia="黑体" w:cs="Times New Roman"/>
+          <w:b/>
+          <w:sz w:val="30"/>
+          <w:szCs w:val="30"/>
+        </w:rPr>
+        <w:t>论文组织结构</w:t>
       </w:r>
     </w:p>
     <w:p>
@@ -3300,7 +3376,16 @@
           <w:b/>
           <w:sz w:val="28"/>
         </w:rPr>
-        <w:t>2.1 用户角色与典型场景</w:t>
+        <w:t xml:space="preserve">2.1 </w:t>
+      </w:r>
+      <w:r>
+        <w:rPr>
+          <w:rFonts w:ascii="Times New Roman" w:hAnsi="Times New Roman" w:eastAsia="黑体" w:cs="Times New Roman"/>
+          <w:b/>
+          <w:sz w:val="30"/>
+          <w:szCs w:val="30"/>
+        </w:rPr>
+        <w:t>用户角色与典型场景</w:t>
       </w:r>
     </w:p>
     <w:p>
@@ -3325,6 +3410,10 @@
         <w:spacing w:before="230" w:after="230" w:line="240" w:lineRule="auto"/>
         <w:ind w:firstLine="0"/>
         <w:jc w:val="left"/>
+        <w:rPr>
+          <w:sz w:val="30"/>
+          <w:szCs w:val="30"/>
+        </w:rPr>
       </w:pPr>
       <w:r>
         <w:rPr>
@@ -3332,7 +3421,16 @@
           <w:b/>
           <w:sz w:val="28"/>
         </w:rPr>
-        <w:t>2.2 功能需求</w:t>
+        <w:t xml:space="preserve">2.2 </w:t>
+      </w:r>
+      <w:r>
+        <w:rPr>
+          <w:rFonts w:ascii="Times New Roman" w:hAnsi="Times New Roman" w:eastAsia="黑体" w:cs="Times New Roman"/>
+          <w:b/>
+          <w:sz w:val="30"/>
+          <w:szCs w:val="30"/>
+        </w:rPr>
+        <w:t>功能需求</w:t>
       </w:r>
     </w:p>
     <w:p>
@@ -3884,6 +3982,10 @@
         <w:spacing w:before="230" w:after="230" w:line="240" w:lineRule="auto"/>
         <w:ind w:firstLine="0"/>
         <w:jc w:val="left"/>
+        <w:rPr>
+          <w:sz w:val="30"/>
+          <w:szCs w:val="30"/>
+        </w:rPr>
       </w:pPr>
       <w:r>
         <w:rPr>
@@ -3891,7 +3993,16 @@
           <w:b/>
           <w:sz w:val="28"/>
         </w:rPr>
-        <w:t>2.3 非功能需求</w:t>
+        <w:t xml:space="preserve">2.3 </w:t>
+      </w:r>
+      <w:r>
+        <w:rPr>
+          <w:rFonts w:ascii="Times New Roman" w:hAnsi="Times New Roman" w:eastAsia="黑体" w:cs="Times New Roman"/>
+          <w:b/>
+          <w:sz w:val="30"/>
+          <w:szCs w:val="30"/>
+        </w:rPr>
+        <w:t>非功能需求</w:t>
       </w:r>
     </w:p>
     <w:p>
@@ -3916,6 +4027,10 @@
         <w:spacing w:before="230" w:after="230" w:line="240" w:lineRule="auto"/>
         <w:ind w:firstLine="0"/>
         <w:jc w:val="left"/>
+        <w:rPr>
+          <w:sz w:val="30"/>
+          <w:szCs w:val="30"/>
+        </w:rPr>
       </w:pPr>
       <w:r>
         <w:rPr>
@@ -3923,7 +4038,16 @@
           <w:b/>
           <w:sz w:val="28"/>
         </w:rPr>
-        <w:t>2.4 可行性分析</w:t>
+        <w:t xml:space="preserve">2.4 </w:t>
+      </w:r>
+      <w:r>
+        <w:rPr>
+          <w:rFonts w:ascii="Times New Roman" w:hAnsi="Times New Roman" w:eastAsia="黑体" w:cs="Times New Roman"/>
+          <w:b/>
+          <w:sz w:val="30"/>
+          <w:szCs w:val="30"/>
+        </w:rPr>
+        <w:t>可行性分析</w:t>
       </w:r>
     </w:p>
     <w:p>
@@ -4001,7 +4125,16 @@
           <w:b/>
           <w:sz w:val="28"/>
         </w:rPr>
-        <w:t>3.1 总体架构</w:t>
+        <w:t xml:space="preserve">3.1 </w:t>
+      </w:r>
+      <w:r>
+        <w:rPr>
+          <w:rFonts w:ascii="Times New Roman" w:hAnsi="Times New Roman" w:eastAsia="黑体" w:cs="Times New Roman"/>
+          <w:b/>
+          <w:sz w:val="30"/>
+          <w:szCs w:val="30"/>
+        </w:rPr>
+        <w:t>总体架构</w:t>
       </w:r>
     </w:p>
     <w:p>
@@ -4575,7 +4708,16 @@
           <w:b/>
           <w:sz w:val="28"/>
         </w:rPr>
-        <w:t>3.2 功能模块划分</w:t>
+        <w:t xml:space="preserve">3.2 </w:t>
+      </w:r>
+      <w:r>
+        <w:rPr>
+          <w:rFonts w:ascii="Times New Roman" w:hAnsi="Times New Roman" w:eastAsia="黑体" w:cs="Times New Roman"/>
+          <w:b/>
+          <w:sz w:val="30"/>
+          <w:szCs w:val="30"/>
+        </w:rPr>
+        <w:t>功能模块划分</w:t>
       </w:r>
     </w:p>
     <w:p>
@@ -4600,6 +4742,10 @@
         <w:spacing w:before="230" w:after="230" w:line="240" w:lineRule="auto"/>
         <w:ind w:firstLine="0"/>
         <w:jc w:val="left"/>
+        <w:rPr>
+          <w:sz w:val="30"/>
+          <w:szCs w:val="30"/>
+        </w:rPr>
       </w:pPr>
       <w:r>
         <w:rPr>
@@ -4607,7 +4753,16 @@
           <w:b/>
           <w:sz w:val="28"/>
         </w:rPr>
-        <w:t>3.3 统一数据模型与坐标空间</w:t>
+        <w:t xml:space="preserve">3.3 </w:t>
+      </w:r>
+      <w:r>
+        <w:rPr>
+          <w:rFonts w:ascii="Times New Roman" w:hAnsi="Times New Roman" w:eastAsia="黑体" w:cs="Times New Roman"/>
+          <w:b/>
+          <w:sz w:val="30"/>
+          <w:szCs w:val="30"/>
+        </w:rPr>
+        <w:t>统一数据模型与坐标空间</w:t>
       </w:r>
     </w:p>
     <w:p>
@@ -4654,7 +4809,16 @@
           <w:b/>
           <w:sz w:val="28"/>
         </w:rPr>
-        <w:t>3.4 本地存储结构</w:t>
+        <w:t xml:space="preserve">3.4 </w:t>
+      </w:r>
+      <w:r>
+        <w:rPr>
+          <w:rFonts w:ascii="Times New Roman" w:hAnsi="Times New Roman" w:eastAsia="黑体" w:cs="Times New Roman"/>
+          <w:b/>
+          <w:sz w:val="30"/>
+          <w:szCs w:val="30"/>
+        </w:rPr>
+        <w:t>本地存储结构</w:t>
       </w:r>
     </w:p>
     <w:p>
@@ -4702,7 +4866,7 @@
       <w:tr>
         <w:trPr>
           <w:cantSplit/>
-          <w:tblHeader w:val="true"/>
+          <w:tblHeader/>
           <w:jc w:val="center"/>
         </w:trPr>
         <w:tc>
@@ -5435,7 +5599,16 @@
           <w:b/>
           <w:sz w:val="28"/>
         </w:rPr>
-        <w:t>3.5 云端数据与接口设计</w:t>
+        <w:t xml:space="preserve">3.5 </w:t>
+      </w:r>
+      <w:r>
+        <w:rPr>
+          <w:rFonts w:ascii="Times New Roman" w:hAnsi="Times New Roman" w:eastAsia="黑体" w:cs="Times New Roman"/>
+          <w:b/>
+          <w:sz w:val="30"/>
+          <w:szCs w:val="30"/>
+        </w:rPr>
+        <w:t>云端数据与接口设计</w:t>
       </w:r>
     </w:p>
     <w:p>
@@ -5484,7 +5657,7 @@
       </w:pPr>
       <w:r>
         <w:rPr>
-          <w:rFonts w:ascii="Times New Roman" w:hAnsi="Times New Roman" w:eastAsia="黑体" w:cs="Times New Roman"/>
+          <w:rFonts w:hint="eastAsia" w:ascii="黑体" w:hAnsi="黑体" w:eastAsia="黑体" w:cs="黑体"/>
           <w:b/>
           <w:sz w:val="36"/>
         </w:rPr>
@@ -5513,7 +5686,16 @@
           <w:b/>
           <w:sz w:val="28"/>
         </w:rPr>
-        <w:t>4.1 笔记库与导航</w:t>
+        <w:t xml:space="preserve">4.1 </w:t>
+      </w:r>
+      <w:r>
+        <w:rPr>
+          <w:rFonts w:ascii="Times New Roman" w:hAnsi="Times New Roman" w:eastAsia="黑体" w:cs="Times New Roman"/>
+          <w:b/>
+          <w:sz w:val="30"/>
+          <w:szCs w:val="30"/>
+        </w:rPr>
+        <w:t>笔记库与导航</w:t>
       </w:r>
     </w:p>
     <w:p>
@@ -5545,7 +5727,16 @@
           <w:b/>
           <w:sz w:val="28"/>
         </w:rPr>
-        <w:t>4.2 手写画布与工具状态</w:t>
+        <w:t xml:space="preserve">4.2 </w:t>
+      </w:r>
+      <w:r>
+        <w:rPr>
+          <w:rFonts w:ascii="Times New Roman" w:hAnsi="Times New Roman" w:eastAsia="黑体" w:cs="Times New Roman"/>
+          <w:b/>
+          <w:sz w:val="30"/>
+          <w:szCs w:val="30"/>
+        </w:rPr>
+        <w:t>手写画布与工具状态</w:t>
       </w:r>
     </w:p>
     <w:p>
@@ -5592,7 +5783,16 @@
           <w:b/>
           <w:sz w:val="28"/>
         </w:rPr>
-        <w:t>4.3 文本、图片与图形编辑</w:t>
+        <w:t xml:space="preserve">4.3 </w:t>
+      </w:r>
+      <w:r>
+        <w:rPr>
+          <w:rFonts w:ascii="Times New Roman" w:hAnsi="Times New Roman" w:eastAsia="黑体" w:cs="Times New Roman"/>
+          <w:b/>
+          <w:sz w:val="30"/>
+          <w:szCs w:val="30"/>
+        </w:rPr>
+        <w:t>文本、图片与图形编辑</w:t>
       </w:r>
     </w:p>
     <w:p>
@@ -5624,7 +5824,16 @@
           <w:b/>
           <w:sz w:val="28"/>
         </w:rPr>
-        <w:t>4.4 PDF 导入、批注与导出</w:t>
+        <w:t xml:space="preserve">4.4 </w:t>
+      </w:r>
+      <w:r>
+        <w:rPr>
+          <w:rFonts w:ascii="Times New Roman" w:hAnsi="Times New Roman" w:eastAsia="黑体" w:cs="Times New Roman"/>
+          <w:b/>
+          <w:sz w:val="30"/>
+          <w:szCs w:val="30"/>
+        </w:rPr>
+        <w:t>PDF 导入、批注与导出</w:t>
       </w:r>
     </w:p>
     <w:p>
@@ -5656,7 +5865,16 @@
           <w:b/>
           <w:sz w:val="28"/>
         </w:rPr>
-        <w:t>4.5 本地识别与手写美化</w:t>
+        <w:t xml:space="preserve">4.5 </w:t>
+      </w:r>
+      <w:r>
+        <w:rPr>
+          <w:rFonts w:ascii="Times New Roman" w:hAnsi="Times New Roman" w:eastAsia="黑体" w:cs="Times New Roman"/>
+          <w:b/>
+          <w:sz w:val="30"/>
+          <w:szCs w:val="30"/>
+        </w:rPr>
+        <w:t>本地识别与手写美化</w:t>
       </w:r>
     </w:p>
     <w:p>
@@ -5688,7 +5906,16 @@
           <w:b/>
           <w:sz w:val="28"/>
         </w:rPr>
-        <w:t>4.6 客户端账号与同步状态</w:t>
+        <w:t xml:space="preserve">4.6 </w:t>
+      </w:r>
+      <w:r>
+        <w:rPr>
+          <w:rFonts w:ascii="Times New Roman" w:hAnsi="Times New Roman" w:eastAsia="黑体" w:cs="Times New Roman"/>
+          <w:b/>
+          <w:sz w:val="30"/>
+          <w:szCs w:val="30"/>
+        </w:rPr>
+        <w:t>客户端账号与同步状态</w:t>
       </w:r>
     </w:p>
     <w:p>
@@ -5737,7 +5964,7 @@
       </w:pPr>
       <w:r>
         <w:rPr>
-          <w:rFonts w:ascii="Times New Roman" w:hAnsi="Times New Roman" w:eastAsia="黑体" w:cs="Times New Roman"/>
+          <w:rFonts w:hint="eastAsia" w:ascii="黑体" w:hAnsi="黑体" w:eastAsia="黑体" w:cs="黑体"/>
           <w:b/>
           <w:sz w:val="36"/>
         </w:rPr>
@@ -5766,7 +5993,16 @@
           <w:b/>
           <w:sz w:val="28"/>
         </w:rPr>
-        <w:t>5.1 服务端技术栈与职责边界</w:t>
+        <w:t xml:space="preserve">5.1 </w:t>
+      </w:r>
+      <w:r>
+        <w:rPr>
+          <w:rFonts w:ascii="Times New Roman" w:hAnsi="Times New Roman" w:eastAsia="黑体" w:cs="Times New Roman"/>
+          <w:b/>
+          <w:sz w:val="30"/>
+          <w:szCs w:val="30"/>
+        </w:rPr>
+        <w:t>服务端技术栈与职责边界</w:t>
       </w:r>
     </w:p>
     <w:p>
@@ -5798,7 +6034,16 @@
           <w:b/>
           <w:sz w:val="28"/>
         </w:rPr>
-        <w:t>5.2 认证、设备与附件安全</w:t>
+        <w:t xml:space="preserve">5.2 </w:t>
+      </w:r>
+      <w:r>
+        <w:rPr>
+          <w:rFonts w:ascii="Times New Roman" w:hAnsi="Times New Roman" w:eastAsia="黑体" w:cs="Times New Roman"/>
+          <w:b/>
+          <w:sz w:val="30"/>
+          <w:szCs w:val="30"/>
+        </w:rPr>
+        <w:t>认证、设备与附件安全</w:t>
       </w:r>
     </w:p>
     <w:p>
@@ -5845,7 +6090,16 @@
           <w:b/>
           <w:sz w:val="28"/>
         </w:rPr>
-        <w:t>5.3 首次合并与增量同步</w:t>
+        <w:t xml:space="preserve">5.3 </w:t>
+      </w:r>
+      <w:r>
+        <w:rPr>
+          <w:rFonts w:ascii="Times New Roman" w:hAnsi="Times New Roman" w:eastAsia="黑体" w:cs="Times New Roman"/>
+          <w:b/>
+          <w:sz w:val="30"/>
+          <w:szCs w:val="30"/>
+        </w:rPr>
+        <w:t>首次合并与增量同步</w:t>
       </w:r>
     </w:p>
     <w:p>
@@ -5892,7 +6146,16 @@
           <w:b/>
           <w:sz w:val="28"/>
         </w:rPr>
-        <w:t>5.4 冲突与可恢复删除</w:t>
+        <w:t xml:space="preserve">5.4 </w:t>
+      </w:r>
+      <w:r>
+        <w:rPr>
+          <w:rFonts w:ascii="Times New Roman" w:hAnsi="Times New Roman" w:eastAsia="黑体" w:cs="Times New Roman"/>
+          <w:b/>
+          <w:sz w:val="30"/>
+          <w:szCs w:val="30"/>
+        </w:rPr>
+        <w:t>冲突与可恢复删除</w:t>
       </w:r>
     </w:p>
     <w:p>
@@ -6724,7 +6987,16 @@
           <w:b/>
           <w:sz w:val="28"/>
         </w:rPr>
-        <w:t>5.5 当前实现边界</w:t>
+        <w:t xml:space="preserve">5.5 </w:t>
+      </w:r>
+      <w:r>
+        <w:rPr>
+          <w:rFonts w:ascii="Times New Roman" w:hAnsi="Times New Roman" w:eastAsia="黑体" w:cs="Times New Roman"/>
+          <w:b/>
+          <w:sz w:val="30"/>
+          <w:szCs w:val="30"/>
+        </w:rPr>
+        <w:t>当前实现边界</w:t>
       </w:r>
     </w:p>
     <w:p>
@@ -6802,7 +7074,16 @@
           <w:b/>
           <w:sz w:val="28"/>
         </w:rPr>
-        <w:t>6.1 测试环境与方法</w:t>
+        <w:t xml:space="preserve">6.1 </w:t>
+      </w:r>
+      <w:r>
+        <w:rPr>
+          <w:rFonts w:ascii="Times New Roman" w:hAnsi="Times New Roman" w:eastAsia="黑体" w:cs="Times New Roman"/>
+          <w:b/>
+          <w:sz w:val="30"/>
+          <w:szCs w:val="30"/>
+        </w:rPr>
+        <w:t>测试环境与方法</w:t>
       </w:r>
     </w:p>
     <w:p>
@@ -6834,7 +7115,16 @@
           <w:b/>
           <w:sz w:val="28"/>
         </w:rPr>
-        <w:t>6.2 客户端测试结果</w:t>
+        <w:t xml:space="preserve">6.2 </w:t>
+      </w:r>
+      <w:r>
+        <w:rPr>
+          <w:rFonts w:ascii="Times New Roman" w:hAnsi="Times New Roman" w:eastAsia="黑体" w:cs="Times New Roman"/>
+          <w:b/>
+          <w:sz w:val="30"/>
+          <w:szCs w:val="30"/>
+        </w:rPr>
+        <w:t>客户端测试结果</w:t>
       </w:r>
     </w:p>
     <w:p>
@@ -7408,7 +7698,16 @@
           <w:b/>
           <w:sz w:val="28"/>
         </w:rPr>
-        <w:t>6.3 服务端测试结果</w:t>
+        <w:t xml:space="preserve">6.3 </w:t>
+      </w:r>
+      <w:r>
+        <w:rPr>
+          <w:rFonts w:ascii="Times New Roman" w:hAnsi="Times New Roman" w:eastAsia="黑体" w:cs="Times New Roman"/>
+          <w:b/>
+          <w:sz w:val="30"/>
+          <w:szCs w:val="30"/>
+        </w:rPr>
+        <w:t>服务端测试结果</w:t>
       </w:r>
     </w:p>
     <w:p>
@@ -7982,7 +8281,16 @@
           <w:b/>
           <w:sz w:val="28"/>
         </w:rPr>
-        <w:t>6.4 结果分析与不足</w:t>
+        <w:t xml:space="preserve">6.4 </w:t>
+      </w:r>
+      <w:r>
+        <w:rPr>
+          <w:rFonts w:ascii="Times New Roman" w:hAnsi="Times New Roman" w:eastAsia="黑体" w:cs="Times New Roman"/>
+          <w:b/>
+          <w:sz w:val="30"/>
+          <w:szCs w:val="30"/>
+        </w:rPr>
+        <w:t>结果分析与不足</w:t>
       </w:r>
     </w:p>
     <w:p>
@@ -8052,7 +8360,16 @@
           <w:b/>
           <w:sz w:val="28"/>
         </w:rPr>
-        <w:t>7.1 工作总结</w:t>
+        <w:t xml:space="preserve">7.1 </w:t>
+      </w:r>
+      <w:r>
+        <w:rPr>
+          <w:rFonts w:ascii="Times New Roman" w:hAnsi="Times New Roman" w:eastAsia="黑体" w:cs="Times New Roman"/>
+          <w:b/>
+          <w:sz w:val="30"/>
+          <w:szCs w:val="30"/>
+        </w:rPr>
+        <w:t>工作总结</w:t>
       </w:r>
     </w:p>
     <w:p>
@@ -8084,7 +8401,16 @@
           <w:b/>
           <w:sz w:val="28"/>
         </w:rPr>
-        <w:t>7.2 主要特点</w:t>
+        <w:t xml:space="preserve">7.2 </w:t>
+      </w:r>
+      <w:r>
+        <w:rPr>
+          <w:rFonts w:ascii="Times New Roman" w:hAnsi="Times New Roman" w:eastAsia="黑体" w:cs="Times New Roman"/>
+          <w:b/>
+          <w:sz w:val="30"/>
+          <w:szCs w:val="30"/>
+        </w:rPr>
+        <w:t>主要特点</w:t>
       </w:r>
     </w:p>
     <w:p>
@@ -8116,7 +8442,16 @@
           <w:b/>
           <w:sz w:val="28"/>
         </w:rPr>
-        <w:t>7.3 后续展望</w:t>
+        <w:t xml:space="preserve">7.3 </w:t>
+      </w:r>
+      <w:r>
+        <w:rPr>
+          <w:rFonts w:ascii="Times New Roman" w:hAnsi="Times New Roman" w:eastAsia="黑体" w:cs="Times New Roman"/>
+          <w:b/>
+          <w:sz w:val="30"/>
+          <w:szCs w:val="30"/>
+        </w:rPr>
+        <w:t>后续展望</w:t>
       </w:r>
     </w:p>
     <w:p>
@@ -8469,12 +8804,18 @@
         <w:spacing w:before="230" w:after="230" w:line="240" w:lineRule="auto"/>
         <w:ind w:firstLine="0"/>
         <w:jc w:val="left"/>
-      </w:pPr>
-      <w:r>
-        <w:rPr>
-          <w:rFonts w:ascii="Times New Roman" w:hAnsi="Times New Roman" w:eastAsia="黑体" w:cs="Times New Roman"/>
-          <w:b/>
-          <w:sz w:val="28"/>
+        <w:rPr>
+          <w:rFonts w:hint="eastAsia" w:ascii="黑体" w:hAnsi="黑体" w:eastAsia="黑体" w:cs="黑体"/>
+          <w:sz w:val="30"/>
+          <w:szCs w:val="30"/>
+        </w:rPr>
+      </w:pPr>
+      <w:r>
+        <w:rPr>
+          <w:rFonts w:hint="eastAsia" w:ascii="黑体" w:hAnsi="黑体" w:eastAsia="黑体" w:cs="黑体"/>
+          <w:b/>
+          <w:sz w:val="30"/>
+          <w:szCs w:val="30"/>
         </w:rPr>
         <w:t>附录 A  核心资源与同步状态对应关系</w:t>
       </w:r>
@@ -9112,9 +9453,10 @@
       </w:pPr>
       <w:r>
         <w:rPr>
-          <w:rFonts w:ascii="Times New Roman" w:hAnsi="Times New Roman" w:eastAsia="黑体" w:cs="Times New Roman"/>
-          <w:b/>
-          <w:sz w:val="28"/>
+          <w:rFonts w:hint="eastAsia" w:ascii="黑体" w:hAnsi="黑体" w:eastAsia="黑体" w:cs="黑体"/>
+          <w:b/>
+          <w:sz w:val="30"/>
+          <w:szCs w:val="30"/>
         </w:rPr>
         <w:t>附录 B  初稿测试命令</w:t>
       </w:r>
@@ -9133,6 +9475,8 @@
         </w:rPr>
         <w:t>Flutter 客户端测试命令：flutter test。Python 服务端非集成测试命令：在 server 目录执行 uv run pytest -m "not integration"。正式论文修改稿应同时补充依赖 PostgreSQL 与 MinIO 的集成测试结果，并记录运行日期、环境版本和失败重试情况。</w:t>
       </w:r>
+      <w:bookmarkStart w:id="2" w:name="_GoBack"/>
+      <w:bookmarkEnd w:id="2"/>
     </w:p>
     <w:sectPr>
       <w:pgSz w:w="11906" w:h="16838"/>

</xml_diff>